<commit_message>
Kịch bản demo: NCC xác nhận/từ chối lời mời, seed tài khoản và sandbox
- RFQInvitation thêm ACCEPTED, responded_at, decline_reason; API accept/decline-invitation, thông báo cho Buyer
- Frontend: nút Xác nhận tham gia/Từ chối, Buyer thấy phản hồi và lý do; refresh token dùng chung một lần gọi (sửa lỗi 401 sau F5)
- seed_demo có tên người dùng; sandbox thêm seed_sandbox (--reset, --reset-ca); run.local.sh reset
- docs/Kich_ban_demo.md; cập nhật URD/SRS/Test, báo cáo, README

Co-Authored-By: Claude Opus 5.5 <noreply@anthropic.com>
</commit_message>
<xml_diff>
--- a/docs/report/01_De_cuong_bao_cao.docx
+++ b/docs/report/01_De_cuong_bao_cao.docx
@@ -19386,7 +19386,7 @@
                 <w:sz w:val="21"/>
                 <w:szCs w:val="21"/>
               </w:rPr>
-              <w:t xml:space="preserve">Trình bày, demo 8–12 phút; sau môn học: pilot</w:t>
+              <w:t xml:space="preserve">Trình bày, demo 10–12 phút; sau môn học: pilot</w:t>
             </w:r>
           </w:p>
         </w:tc>
@@ -19436,7 +19436,7 @@
         <w:rPr>
           <w:rFonts w:ascii="Times New Roman" w:cs="Times New Roman" w:eastAsia="Times New Roman" w:hAnsi="Times New Roman"/>
         </w:rPr>
-        <w:t xml:space="preserve">Kịch bản demo 8–12 phút: (1) vấn đề và vai trò; (2) Buyer tạo PR có ngân sách, Manager duyệt, Buyer tạo RFQ; (3) mở trình duyệt thứ hai cho Supplier, thông báo đến không cần làm mới trang, hai nhà cung cấp báo giá, TechVision ký số báo giá bằng OTP; (4) Buyer xem bảng điểm, đề xuất, Manager duyệt, phát hành PO; (5) Supplier xác nhận, Buyer nhận hàng, Supplier lập hóa đơn Net 30 có VAT, hóa đơn điện tử được cấp mã, Finance thanh toán 30% qua trang cổng rồi phần còn lại; (6) đánh giá nhà cung cấp, xem dashboard KPI, audit và thử truy cập trái quyền bị chặn.</w:t>
+        <w:t xml:space="preserve">Kịch bản demo 10–12 phút với một công ty mua và hai nhà cung cấp, mỗi vai trò một cửa sổ trình duyệt: (1) vấn đề và vai trò; (2) Buyer tạo PR có ngân sách, Manager duyệt, Buyer tạo RFQ mời hai nhà cung cấp; (3) thông báo đến nhà cung cấp không cần làm mới trang, hai nhà cung cấp xác nhận tham gia rồi báo giá, TechVision ký số báo giá bằng OTP; (4) Buyer xem bảng điểm, đề xuất, Manager duyệt, phát hành PO; (5) Supplier xác nhận, Buyer nhận hàng, Supplier lập hóa đơn Net 30 có VAT, hóa đơn điện tử được cấp mã, Finance thanh toán 30% qua trang cổng rồi phần còn lại; (6) đánh giá nhà cung cấp, xem dashboard KPI, audit và thử truy cập trái quyền bị chặn.</w:t>
       </w:r>
     </w:p>
     <w:p>

</xml_diff>